<commit_message>
Verifying the meteorological claim
</commit_message>
<xml_diff>
--- a/2025 - Nesh/Code and figures for continuum paper/Jake's "reviewer notes" of June 20.docx
+++ b/2025 - Nesh/Code and figures for continuum paper/Jake's "reviewer notes" of June 20.docx
@@ -244,16 +244,43 @@
           <w:kern w:val="0"/>
           <w14:ligatures w14:val="none"/>
         </w:rPr>
-        <w:t xml:space="preserve">I eliminated this equation, referring the reader to the </w:t>
-      </w:r>
-      <w:r>
-        <w:rPr>
-          <w:rFonts w:ascii="Times New Roman" w:eastAsia="Times New Roman" w:hAnsi="Times New Roman" w:cs="Times New Roman"/>
-          <w:color w:val="C00000"/>
-          <w:kern w:val="0"/>
-          <w14:ligatures w14:val="none"/>
-        </w:rPr>
-        <w:t>table for values.</w:t>
+        <w:t xml:space="preserve">I eliminated this equation, </w:t>
+      </w:r>
+      <w:r>
+        <w:rPr>
+          <w:rFonts w:ascii="Times New Roman" w:eastAsia="Times New Roman" w:hAnsi="Times New Roman" w:cs="Times New Roman"/>
+          <w:color w:val="C00000"/>
+          <w:kern w:val="0"/>
+          <w14:ligatures w14:val="none"/>
+        </w:rPr>
+        <w:t>and referred</w:t>
+      </w:r>
+      <w:r>
+        <w:rPr>
+          <w:rFonts w:ascii="Times New Roman" w:eastAsia="Times New Roman" w:hAnsi="Times New Roman" w:cs="Times New Roman"/>
+          <w:color w:val="C00000"/>
+          <w:kern w:val="0"/>
+          <w14:ligatures w14:val="none"/>
+        </w:rPr>
+        <w:t xml:space="preserve"> the reader to the </w:t>
+      </w:r>
+      <w:r>
+        <w:rPr>
+          <w:rFonts w:ascii="Times New Roman" w:eastAsia="Times New Roman" w:hAnsi="Times New Roman" w:cs="Times New Roman"/>
+          <w:color w:val="C00000"/>
+          <w:kern w:val="0"/>
+          <w14:ligatures w14:val="none"/>
+        </w:rPr>
+        <w:t>table for values</w:t>
+      </w:r>
+      <w:r>
+        <w:rPr>
+          <w:rFonts w:ascii="Times New Roman" w:eastAsia="Times New Roman" w:hAnsi="Times New Roman" w:cs="Times New Roman"/>
+          <w:color w:val="C00000"/>
+          <w:kern w:val="0"/>
+          <w14:ligatures w14:val="none"/>
+        </w:rPr>
+        <w:t xml:space="preserve"> of remaining variables.</w:t>
       </w:r>
     </w:p>
     <w:p>
@@ -622,7 +649,7 @@
           <w:kern w:val="0"/>
           <w14:ligatures w14:val="none"/>
         </w:rPr>
-        <w:t>I think what you’ve written makes sense, and I did some additional editing.</w:t>
+        <w:t>I think what you’ve written makes sense, and did some additional editing.</w:t>
       </w:r>
     </w:p>
     <w:p>
@@ -695,7 +722,6 @@
           <w:kern w:val="0"/>
           <w14:ligatures w14:val="none"/>
         </w:rPr>
-        <w:lastRenderedPageBreak/>
         <w:t>Done</w:t>
       </w:r>
       <w:r>
@@ -974,93 +1000,254 @@
           <w:kern w:val="0"/>
           <w14:ligatures w14:val="none"/>
         </w:rPr>
-        <w:t xml:space="preserve">(see </w:t>
+        <w:t>(see</w:t>
+      </w:r>
+      <w:r>
+        <w:rPr>
+          <w:rFonts w:ascii="Times New Roman" w:eastAsia="Times New Roman" w:hAnsi="Times New Roman" w:cs="Times New Roman"/>
+          <w:color w:val="C00000"/>
+          <w:kern w:val="0"/>
+          <w14:ligatures w14:val="none"/>
+        </w:rPr>
+        <w:t xml:space="preserve"> </w:t>
+      </w:r>
+      <w:hyperlink r:id="rId6" w:history="1">
+        <w:r>
+          <w:rPr>
+            <w:rStyle w:val="Hyperlink"/>
+            <w:rFonts w:ascii="Times New Roman" w:eastAsia="Times New Roman" w:hAnsi="Times New Roman" w:cs="Times New Roman"/>
+            <w:kern w:val="0"/>
+            <w14:ligatures w14:val="none"/>
+          </w:rPr>
+          <w:t>https://github.com/upschemistry/icecontinuu</w:t>
+        </w:r>
+        <w:r>
+          <w:rPr>
+            <w:rStyle w:val="Hyperlink"/>
+            <w:rFonts w:ascii="Times New Roman" w:eastAsia="Times New Roman" w:hAnsi="Times New Roman" w:cs="Times New Roman"/>
+            <w:kern w:val="0"/>
+            <w14:ligatures w14:val="none"/>
+          </w:rPr>
+          <w:t>m</w:t>
+        </w:r>
+        <w:r>
+          <w:rPr>
+            <w:rStyle w:val="Hyperlink"/>
+            <w:rFonts w:ascii="Times New Roman" w:eastAsia="Times New Roman" w:hAnsi="Times New Roman" w:cs="Times New Roman"/>
+            <w:kern w:val="0"/>
+            <w14:ligatures w14:val="none"/>
+          </w:rPr>
+          <w:t>/blob/master/2025%20-%20Nesh/Code%20and%20figures%20for%20continuum%20paper/Make%20Figure%20-%20Limit%20cycles.ipynb</w:t>
+        </w:r>
+      </w:hyperlink>
+      <w:r>
+        <w:rPr>
+          <w:rFonts w:ascii="Times New Roman" w:eastAsia="Times New Roman" w:hAnsi="Times New Roman" w:cs="Times New Roman"/>
+          <w:color w:val="C00000"/>
+          <w:kern w:val="0"/>
+          <w14:ligatures w14:val="none"/>
+        </w:rPr>
+        <w:t>)</w:t>
+      </w:r>
+    </w:p>
+    <w:p>
+      <w:pPr>
+        <w:rPr>
+          <w:rFonts w:ascii="Times New Roman" w:eastAsia="Times New Roman" w:hAnsi="Times New Roman" w:cs="Times New Roman"/>
+          <w:kern w:val="0"/>
+          <w14:ligatures w14:val="none"/>
+        </w:rPr>
+      </w:pPr>
+    </w:p>
+    <w:p>
+      <w:pPr>
+        <w:rPr>
+          <w:rFonts w:ascii="Times New Roman" w:eastAsia="Times New Roman" w:hAnsi="Times New Roman" w:cs="Times New Roman"/>
+          <w:kern w:val="0"/>
+          <w14:ligatures w14:val="none"/>
+        </w:rPr>
+      </w:pPr>
+      <w:r>
+        <w:rPr>
+          <w:rFonts w:ascii="Times New Roman" w:eastAsia="Times New Roman" w:hAnsi="Times New Roman" w:cs="Times New Roman"/>
+          <w:kern w:val="0"/>
+          <w14:ligatures w14:val="none"/>
+        </w:rPr>
+        <w:t xml:space="preserve">Line 302 I think we talked about how “number of steps” isn’t actually what you’re depicting, but rather the difference in the max and min </w:t>
       </w:r>
       <w:proofErr w:type="spellStart"/>
       <w:r>
         <w:rPr>
           <w:rFonts w:ascii="Times New Roman" w:eastAsia="Times New Roman" w:hAnsi="Times New Roman" w:cs="Times New Roman"/>
-          <w:color w:val="C00000"/>
-          <w:kern w:val="0"/>
-          <w14:ligatures w14:val="none"/>
-        </w:rPr>
-        <w:t>icecontinuum</w:t>
+          <w:kern w:val="0"/>
+          <w14:ligatures w14:val="none"/>
+        </w:rPr>
+        <w:t>N_tot</w:t>
       </w:r>
       <w:proofErr w:type="spellEnd"/>
       <w:r>
         <w:rPr>
           <w:rFonts w:ascii="Times New Roman" w:eastAsia="Times New Roman" w:hAnsi="Times New Roman" w:cs="Times New Roman"/>
-          <w:color w:val="C00000"/>
-          <w:kern w:val="0"/>
-          <w14:ligatures w14:val="none"/>
-        </w:rPr>
-        <w:t xml:space="preserve">/2025 - Nesh/Code and figures for continuum paper/Make Figure - Limit </w:t>
+          <w:kern w:val="0"/>
+          <w14:ligatures w14:val="none"/>
+        </w:rPr>
+        <w:t>?</w:t>
+      </w:r>
+    </w:p>
+    <w:p>
+      <w:pPr>
+        <w:rPr>
+          <w:rFonts w:ascii="Times New Roman" w:eastAsia="Times New Roman" w:hAnsi="Times New Roman" w:cs="Times New Roman"/>
+          <w:kern w:val="0"/>
+          <w14:ligatures w14:val="none"/>
+        </w:rPr>
+      </w:pPr>
+    </w:p>
+    <w:p>
+      <w:pPr>
+        <w:ind w:left="720"/>
+        <w:rPr>
+          <w:rFonts w:ascii="Times New Roman" w:eastAsia="Times New Roman" w:hAnsi="Times New Roman" w:cs="Times New Roman"/>
+          <w:color w:val="C00000"/>
+          <w:kern w:val="0"/>
+          <w14:ligatures w14:val="none"/>
+        </w:rPr>
+      </w:pPr>
+      <w:r>
+        <w:rPr>
+          <w:rFonts w:ascii="Times New Roman" w:eastAsia="Times New Roman" w:hAnsi="Times New Roman" w:cs="Times New Roman"/>
+          <w:color w:val="C00000"/>
+          <w:kern w:val="0"/>
+          <w14:ligatures w14:val="none"/>
+        </w:rPr>
+        <w:t>Done.</w:t>
+      </w:r>
+    </w:p>
+    <w:p>
+      <w:pPr>
+        <w:rPr>
+          <w:rFonts w:ascii="Times New Roman" w:eastAsia="Times New Roman" w:hAnsi="Times New Roman" w:cs="Times New Roman"/>
+          <w:kern w:val="0"/>
+          <w14:ligatures w14:val="none"/>
+        </w:rPr>
+      </w:pPr>
+    </w:p>
+    <w:p>
+      <w:pPr>
+        <w:rPr>
+          <w:rFonts w:ascii="Times New Roman" w:eastAsia="Times New Roman" w:hAnsi="Times New Roman" w:cs="Times New Roman"/>
+          <w:kern w:val="0"/>
+          <w14:ligatures w14:val="none"/>
+        </w:rPr>
+      </w:pPr>
+      <w:r>
+        <w:rPr>
+          <w:rFonts w:ascii="Times New Roman" w:eastAsia="Times New Roman" w:hAnsi="Times New Roman" w:cs="Times New Roman"/>
+          <w:kern w:val="0"/>
+          <w14:ligatures w14:val="none"/>
+        </w:rPr>
+        <w:t xml:space="preserve">Figure 7: Can I get these </w:t>
+      </w:r>
+      <w:proofErr w:type="gramStart"/>
+      <w:r>
+        <w:rPr>
+          <w:rFonts w:ascii="Times New Roman" w:eastAsia="Times New Roman" w:hAnsi="Times New Roman" w:cs="Times New Roman"/>
+          <w:kern w:val="0"/>
+          <w14:ligatures w14:val="none"/>
+        </w:rPr>
+        <w:t>data,</w:t>
+      </w:r>
+      <w:proofErr w:type="gramEnd"/>
+      <w:r>
+        <w:rPr>
+          <w:rFonts w:ascii="Times New Roman" w:eastAsia="Times New Roman" w:hAnsi="Times New Roman" w:cs="Times New Roman"/>
+          <w:kern w:val="0"/>
+          <w14:ligatures w14:val="none"/>
+        </w:rPr>
+        <w:t xml:space="preserve"> I can use R to fit a linear model here that we could then interpret</w:t>
+      </w:r>
+    </w:p>
+    <w:p>
+      <w:pPr>
+        <w:rPr>
+          <w:rFonts w:ascii="Times New Roman" w:eastAsia="Times New Roman" w:hAnsi="Times New Roman" w:cs="Times New Roman"/>
+          <w:kern w:val="0"/>
+          <w14:ligatures w14:val="none"/>
+        </w:rPr>
+      </w:pPr>
+    </w:p>
+    <w:p>
+      <w:pPr>
+        <w:ind w:left="720"/>
+        <w:rPr>
+          <w:rFonts w:ascii="Times New Roman" w:eastAsia="Times New Roman" w:hAnsi="Times New Roman" w:cs="Times New Roman"/>
+          <w:color w:val="C00000"/>
+          <w:kern w:val="0"/>
+          <w14:ligatures w14:val="none"/>
+        </w:rPr>
+      </w:pPr>
+      <w:r>
+        <w:rPr>
+          <w:rFonts w:ascii="Times New Roman" w:eastAsia="Times New Roman" w:hAnsi="Times New Roman" w:cs="Times New Roman"/>
+          <w:color w:val="C00000"/>
+          <w:kern w:val="0"/>
+          <w14:ligatures w14:val="none"/>
+        </w:rPr>
+        <w:lastRenderedPageBreak/>
+        <w:t>Done</w:t>
+      </w:r>
+      <w:r>
+        <w:rPr>
+          <w:rFonts w:ascii="Times New Roman" w:eastAsia="Times New Roman" w:hAnsi="Times New Roman" w:cs="Times New Roman"/>
+          <w:color w:val="C00000"/>
+          <w:kern w:val="0"/>
+          <w14:ligatures w14:val="none"/>
+        </w:rPr>
+        <w:t>.</w:t>
+      </w:r>
+    </w:p>
+    <w:p>
+      <w:pPr>
+        <w:rPr>
+          <w:rFonts w:ascii="Times New Roman" w:eastAsia="Times New Roman" w:hAnsi="Times New Roman" w:cs="Times New Roman"/>
+          <w:kern w:val="0"/>
+          <w14:ligatures w14:val="none"/>
+        </w:rPr>
+      </w:pPr>
+    </w:p>
+    <w:p>
+      <w:pPr>
+        <w:rPr>
+          <w:rFonts w:ascii="Times New Roman" w:eastAsia="Times New Roman" w:hAnsi="Times New Roman" w:cs="Times New Roman"/>
+          <w:kern w:val="0"/>
+          <w14:ligatures w14:val="none"/>
+        </w:rPr>
+      </w:pPr>
+      <w:r>
+        <w:rPr>
+          <w:rFonts w:ascii="Times New Roman" w:eastAsia="Times New Roman" w:hAnsi="Times New Roman" w:cs="Times New Roman"/>
+          <w:kern w:val="0"/>
+          <w14:ligatures w14:val="none"/>
+        </w:rPr>
+        <w:t xml:space="preserve">Line 364: We’ll need more about </w:t>
       </w:r>
       <w:proofErr w:type="spellStart"/>
-      <w:proofErr w:type="gramStart"/>
-      <w:r>
-        <w:rPr>
-          <w:rFonts w:ascii="Times New Roman" w:eastAsia="Times New Roman" w:hAnsi="Times New Roman" w:cs="Times New Roman"/>
-          <w:color w:val="C00000"/>
-          <w:kern w:val="0"/>
-          <w14:ligatures w14:val="none"/>
-        </w:rPr>
-        <w:t>cycles.ipynb</w:t>
+      <w:r>
+        <w:rPr>
+          <w:rFonts w:ascii="Times New Roman" w:eastAsia="Times New Roman" w:hAnsi="Times New Roman" w:cs="Times New Roman"/>
+          <w:kern w:val="0"/>
+          <w14:ligatures w14:val="none"/>
+        </w:rPr>
+        <w:t>FitzHugh</w:t>
       </w:r>
       <w:proofErr w:type="spellEnd"/>
-      <w:proofErr w:type="gramEnd"/>
-      <w:r>
-        <w:rPr>
-          <w:rFonts w:ascii="Times New Roman" w:eastAsia="Times New Roman" w:hAnsi="Times New Roman" w:cs="Times New Roman"/>
-          <w:color w:val="C00000"/>
-          <w:kern w:val="0"/>
-          <w14:ligatures w14:val="none"/>
-        </w:rPr>
-        <w:t>)</w:t>
-      </w:r>
-    </w:p>
-    <w:p>
-      <w:pPr>
-        <w:rPr>
-          <w:rFonts w:ascii="Times New Roman" w:eastAsia="Times New Roman" w:hAnsi="Times New Roman" w:cs="Times New Roman"/>
-          <w:kern w:val="0"/>
-          <w14:ligatures w14:val="none"/>
-        </w:rPr>
-      </w:pPr>
-    </w:p>
-    <w:p>
-      <w:pPr>
-        <w:rPr>
-          <w:rFonts w:ascii="Times New Roman" w:eastAsia="Times New Roman" w:hAnsi="Times New Roman" w:cs="Times New Roman"/>
-          <w:kern w:val="0"/>
-          <w14:ligatures w14:val="none"/>
-        </w:rPr>
-      </w:pPr>
-      <w:r>
-        <w:rPr>
-          <w:rFonts w:ascii="Times New Roman" w:eastAsia="Times New Roman" w:hAnsi="Times New Roman" w:cs="Times New Roman"/>
-          <w:kern w:val="0"/>
-          <w14:ligatures w14:val="none"/>
-        </w:rPr>
-        <w:t xml:space="preserve">Line 302 I think we talked about how “number of steps” isn’t actually what you’re depicting, but rather the difference in the max and min </w:t>
-      </w:r>
-      <w:proofErr w:type="spellStart"/>
-      <w:r>
-        <w:rPr>
-          <w:rFonts w:ascii="Times New Roman" w:eastAsia="Times New Roman" w:hAnsi="Times New Roman" w:cs="Times New Roman"/>
-          <w:kern w:val="0"/>
-          <w14:ligatures w14:val="none"/>
-        </w:rPr>
-        <w:t>N_tot</w:t>
-      </w:r>
-      <w:proofErr w:type="spellEnd"/>
-      <w:r>
-        <w:rPr>
-          <w:rFonts w:ascii="Times New Roman" w:eastAsia="Times New Roman" w:hAnsi="Times New Roman" w:cs="Times New Roman"/>
-          <w:kern w:val="0"/>
-          <w14:ligatures w14:val="none"/>
-        </w:rPr>
-        <w:t>?</w:t>
+      <w:r>
+        <w:rPr>
+          <w:rFonts w:ascii="Times New Roman" w:eastAsia="Times New Roman" w:hAnsi="Times New Roman" w:cs="Times New Roman"/>
+          <w:kern w:val="0"/>
+          <w14:ligatures w14:val="none"/>
+        </w:rPr>
+        <w:t>-Nagumo than what was said, even if just a bit?</w:t>
       </w:r>
     </w:p>
     <w:p>
@@ -1075,171 +1262,24 @@
     <w:p>
       <w:pPr>
         <w:ind w:left="720"/>
-        <w:rPr>
-          <w:rFonts w:ascii="Times New Roman" w:eastAsia="Times New Roman" w:hAnsi="Times New Roman" w:cs="Times New Roman"/>
-          <w:color w:val="C00000"/>
-          <w:kern w:val="0"/>
-          <w14:ligatures w14:val="none"/>
-        </w:rPr>
-      </w:pPr>
-      <w:r>
-        <w:rPr>
-          <w:rFonts w:ascii="Times New Roman" w:eastAsia="Times New Roman" w:hAnsi="Times New Roman" w:cs="Times New Roman"/>
-          <w:color w:val="C00000"/>
-          <w:kern w:val="0"/>
-          <w14:ligatures w14:val="none"/>
-        </w:rPr>
-        <w:t>Done.</w:t>
-      </w:r>
-    </w:p>
-    <w:p>
-      <w:pPr>
-        <w:rPr>
-          <w:rFonts w:ascii="Times New Roman" w:eastAsia="Times New Roman" w:hAnsi="Times New Roman" w:cs="Times New Roman"/>
-          <w:kern w:val="0"/>
-          <w14:ligatures w14:val="none"/>
-        </w:rPr>
-      </w:pPr>
-    </w:p>
-    <w:p>
-      <w:pPr>
-        <w:rPr>
-          <w:rFonts w:ascii="Times New Roman" w:eastAsia="Times New Roman" w:hAnsi="Times New Roman" w:cs="Times New Roman"/>
-          <w:kern w:val="0"/>
-          <w14:ligatures w14:val="none"/>
-        </w:rPr>
-      </w:pPr>
-      <w:r>
-        <w:rPr>
-          <w:rFonts w:ascii="Times New Roman" w:eastAsia="Times New Roman" w:hAnsi="Times New Roman" w:cs="Times New Roman"/>
-          <w:kern w:val="0"/>
-          <w14:ligatures w14:val="none"/>
-        </w:rPr>
-        <w:t xml:space="preserve">Figure 7: Can I get these </w:t>
-      </w:r>
-      <w:proofErr w:type="gramStart"/>
-      <w:r>
-        <w:rPr>
-          <w:rFonts w:ascii="Times New Roman" w:eastAsia="Times New Roman" w:hAnsi="Times New Roman" w:cs="Times New Roman"/>
-          <w:kern w:val="0"/>
-          <w14:ligatures w14:val="none"/>
-        </w:rPr>
-        <w:t>data,</w:t>
-      </w:r>
-      <w:proofErr w:type="gramEnd"/>
-      <w:r>
-        <w:rPr>
-          <w:rFonts w:ascii="Times New Roman" w:eastAsia="Times New Roman" w:hAnsi="Times New Roman" w:cs="Times New Roman"/>
-          <w:kern w:val="0"/>
-          <w14:ligatures w14:val="none"/>
-        </w:rPr>
-        <w:t xml:space="preserve"> I can use R to fit a linear model here that we could then interpret</w:t>
-      </w:r>
-    </w:p>
-    <w:p>
-      <w:pPr>
-        <w:rPr>
-          <w:rFonts w:ascii="Times New Roman" w:eastAsia="Times New Roman" w:hAnsi="Times New Roman" w:cs="Times New Roman"/>
-          <w:kern w:val="0"/>
-          <w14:ligatures w14:val="none"/>
-        </w:rPr>
-      </w:pPr>
-    </w:p>
-    <w:p>
-      <w:pPr>
-        <w:ind w:left="720"/>
-        <w:rPr>
-          <w:rFonts w:ascii="Times New Roman" w:eastAsia="Times New Roman" w:hAnsi="Times New Roman" w:cs="Times New Roman"/>
-          <w:color w:val="C00000"/>
-          <w:kern w:val="0"/>
-          <w14:ligatures w14:val="none"/>
-        </w:rPr>
-      </w:pPr>
-      <w:r>
-        <w:rPr>
-          <w:rFonts w:ascii="Times New Roman" w:eastAsia="Times New Roman" w:hAnsi="Times New Roman" w:cs="Times New Roman"/>
-          <w:color w:val="C00000"/>
-          <w:kern w:val="0"/>
-          <w14:ligatures w14:val="none"/>
-        </w:rPr>
-        <w:t>Done</w:t>
-      </w:r>
-      <w:r>
-        <w:rPr>
-          <w:rFonts w:ascii="Times New Roman" w:eastAsia="Times New Roman" w:hAnsi="Times New Roman" w:cs="Times New Roman"/>
-          <w:color w:val="C00000"/>
-          <w:kern w:val="0"/>
-          <w14:ligatures w14:val="none"/>
-        </w:rPr>
-        <w:t>.</w:t>
-      </w:r>
-    </w:p>
-    <w:p>
-      <w:pPr>
-        <w:rPr>
-          <w:rFonts w:ascii="Times New Roman" w:eastAsia="Times New Roman" w:hAnsi="Times New Roman" w:cs="Times New Roman"/>
-          <w:kern w:val="0"/>
-          <w14:ligatures w14:val="none"/>
-        </w:rPr>
-      </w:pPr>
-    </w:p>
-    <w:p>
-      <w:pPr>
-        <w:rPr>
-          <w:rFonts w:ascii="Times New Roman" w:eastAsia="Times New Roman" w:hAnsi="Times New Roman" w:cs="Times New Roman"/>
-          <w:kern w:val="0"/>
-          <w14:ligatures w14:val="none"/>
-        </w:rPr>
-      </w:pPr>
-      <w:r>
-        <w:rPr>
-          <w:rFonts w:ascii="Times New Roman" w:eastAsia="Times New Roman" w:hAnsi="Times New Roman" w:cs="Times New Roman"/>
-          <w:kern w:val="0"/>
-          <w14:ligatures w14:val="none"/>
-        </w:rPr>
-        <w:lastRenderedPageBreak/>
-        <w:t xml:space="preserve">Line 364: We’ll need more about </w:t>
-      </w:r>
-      <w:proofErr w:type="spellStart"/>
-      <w:r>
-        <w:rPr>
-          <w:rFonts w:ascii="Times New Roman" w:eastAsia="Times New Roman" w:hAnsi="Times New Roman" w:cs="Times New Roman"/>
-          <w:kern w:val="0"/>
-          <w14:ligatures w14:val="none"/>
-        </w:rPr>
-        <w:t>FitzHugh</w:t>
-      </w:r>
-      <w:proofErr w:type="spellEnd"/>
-      <w:r>
-        <w:rPr>
-          <w:rFonts w:ascii="Times New Roman" w:eastAsia="Times New Roman" w:hAnsi="Times New Roman" w:cs="Times New Roman"/>
-          <w:kern w:val="0"/>
-          <w14:ligatures w14:val="none"/>
-        </w:rPr>
-        <w:t>-Nagumo than what was said, even if just a bit?</w:t>
-      </w:r>
-    </w:p>
-    <w:p>
-      <w:pPr>
-        <w:rPr>
-          <w:rFonts w:ascii="Times New Roman" w:eastAsia="Times New Roman" w:hAnsi="Times New Roman" w:cs="Times New Roman"/>
-          <w:kern w:val="0"/>
-          <w14:ligatures w14:val="none"/>
-        </w:rPr>
-      </w:pPr>
-    </w:p>
-    <w:p>
-      <w:pPr>
-        <w:ind w:left="720"/>
-      </w:pPr>
-      <w:r>
-        <w:rPr>
-          <w:rFonts w:ascii="Times New Roman" w:eastAsia="Times New Roman" w:hAnsi="Times New Roman" w:cs="Times New Roman"/>
-          <w:color w:val="C00000"/>
-          <w:kern w:val="0"/>
-          <w14:ligatures w14:val="none"/>
-        </w:rPr>
-        <w:t>Done, sort of.</w:t>
+      </w:pPr>
+      <w:r>
+        <w:rPr>
+          <w:rFonts w:ascii="Times New Roman" w:eastAsia="Times New Roman" w:hAnsi="Times New Roman" w:cs="Times New Roman"/>
+          <w:color w:val="C00000"/>
+          <w:kern w:val="0"/>
+          <w14:ligatures w14:val="none"/>
+        </w:rPr>
+        <w:t>Done, sort of</w:t>
+      </w:r>
+      <w:r>
+        <w:rPr>
+          <w:rFonts w:ascii="Times New Roman" w:eastAsia="Times New Roman" w:hAnsi="Times New Roman" w:cs="Times New Roman"/>
+          <w:color w:val="C00000"/>
+          <w:kern w:val="0"/>
+          <w14:ligatures w14:val="none"/>
+        </w:rPr>
+        <w:t xml:space="preserve"> (but we should check).</w:t>
       </w:r>
     </w:p>
     <w:sectPr>
@@ -1808,6 +1848,41 @@
       </w:numPr>
     </w:pPr>
   </w:style>
+  <w:style w:type="character" w:styleId="Hyperlink">
+    <w:name w:val="Hyperlink"/>
+    <w:basedOn w:val="DefaultParagraphFont"/>
+    <w:uiPriority w:val="99"/>
+    <w:unhideWhenUsed/>
+    <w:rsid w:val="00041535"/>
+    <w:rPr>
+      <w:color w:val="0563C1" w:themeColor="hyperlink"/>
+      <w:u w:val="single"/>
+    </w:rPr>
+  </w:style>
+  <w:style w:type="character" w:styleId="UnresolvedMention">
+    <w:name w:val="Unresolved Mention"/>
+    <w:basedOn w:val="DefaultParagraphFont"/>
+    <w:uiPriority w:val="99"/>
+    <w:semiHidden/>
+    <w:unhideWhenUsed/>
+    <w:rsid w:val="00041535"/>
+    <w:rPr>
+      <w:color w:val="605E5C"/>
+      <w:shd w:val="clear" w:color="auto" w:fill="E1DFDD"/>
+    </w:rPr>
+  </w:style>
+  <w:style w:type="character" w:styleId="FollowedHyperlink">
+    <w:name w:val="FollowedHyperlink"/>
+    <w:basedOn w:val="DefaultParagraphFont"/>
+    <w:uiPriority w:val="99"/>
+    <w:semiHidden/>
+    <w:unhideWhenUsed/>
+    <w:rsid w:val="00041535"/>
+    <w:rPr>
+      <w:color w:val="954F72" w:themeColor="followedHyperlink"/>
+      <w:u w:val="single"/>
+    </w:rPr>
+  </w:style>
 </w:styles>
 </file>
 

</xml_diff>